<commit_message>
Minor changes to documentation
</commit_message>
<xml_diff>
--- a/docs/project-management/01_Discovery/Northwind-TechnicalDiscovery-04082026.docx
+++ b/docs/project-management/01_Discovery/Northwind-TechnicalDiscovery-04082026.docx
@@ -97,7 +97,7 @@
     <w:p>
       <w:r>
         <w:pict w14:anchorId="5FAFA3A3">
-          <v:rect id="_x0000_i1067" style="width:0;height:1.5pt" o:hralign="center" o:hrstd="t" o:hr="t" fillcolor="#a0a0a0" stroked="f"/>
+          <v:rect id="_x0000_i1025" style="width:0;height:1.5pt" o:hralign="center" o:hrstd="t" o:hr="t" fillcolor="#a0a0a0" stroked="f"/>
         </w:pict>
       </w:r>
     </w:p>
@@ -117,11 +117,6 @@
       </w:r>
     </w:p>
     <w:p>
-      <w:r>
-        <w:t>(Here's where your CCNA knowledge starts paying off.)</w:t>
-      </w:r>
-    </w:p>
-    <w:p>
       <w:pPr>
         <w:numPr>
           <w:ilvl w:val="0"/>
@@ -223,7 +218,7 @@
     <w:p>
       <w:r>
         <w:pict w14:anchorId="70258AF0">
-          <v:rect id="_x0000_i1068" style="width:0;height:1.5pt" o:hralign="center" o:hrstd="t" o:hr="t" fillcolor="#a0a0a0" stroked="f"/>
+          <v:rect id="_x0000_i1026" style="width:0;height:1.5pt" o:hralign="center" o:hrstd="t" o:hr="t" fillcolor="#a0a0a0" stroked="f"/>
         </w:pict>
       </w:r>
     </w:p>
@@ -322,7 +317,7 @@
     <w:p>
       <w:r>
         <w:pict w14:anchorId="6B501A83">
-          <v:rect id="_x0000_i1069" style="width:0;height:1.5pt" o:hralign="center" o:hrstd="t" o:hr="t" fillcolor="#a0a0a0" stroked="f"/>
+          <v:rect id="_x0000_i1027" style="width:0;height:1.5pt" o:hralign="center" o:hrstd="t" o:hr="t" fillcolor="#a0a0a0" stroked="f"/>
         </w:pict>
       </w:r>
     </w:p>
@@ -360,8 +355,19 @@
         </w:numPr>
       </w:pPr>
       <w:r>
+        <w:t>Finance Software</w:t>
+      </w:r>
+    </w:p>
+    <w:p>
+      <w:pPr>
+        <w:numPr>
+          <w:ilvl w:val="0"/>
+          <w:numId w:val="4"/>
+        </w:numPr>
+      </w:pPr>
+      <w:r>
         <w:lastRenderedPageBreak/>
-        <w:t>Finance Software</w:t>
+        <w:t>HR</w:t>
       </w:r>
     </w:p>
     <w:p>
@@ -372,7 +378,7 @@
         </w:numPr>
       </w:pPr>
       <w:r>
-        <w:t>HR</w:t>
+        <w:t>Printing</w:t>
       </w:r>
     </w:p>
     <w:p>
@@ -383,17 +389,6 @@
         </w:numPr>
       </w:pPr>
       <w:r>
-        <w:t>Printing</w:t>
-      </w:r>
-    </w:p>
-    <w:p>
-      <w:pPr>
-        <w:numPr>
-          <w:ilvl w:val="0"/>
-          <w:numId w:val="4"/>
-        </w:numPr>
-      </w:pPr>
-      <w:r>
         <w:t>Databases</w:t>
       </w:r>
     </w:p>
@@ -471,7 +466,7 @@
     <w:p>
       <w:r>
         <w:pict w14:anchorId="7B160135">
-          <v:rect id="_x0000_i1070" style="width:0;height:1.5pt" o:hralign="center" o:hrstd="t" o:hr="t" fillcolor="#a0a0a0" stroked="f"/>
+          <v:rect id="_x0000_i1028" style="width:0;height:1.5pt" o:hralign="center" o:hrstd="t" o:hr="t" fillcolor="#a0a0a0" stroked="f"/>
         </w:pict>
       </w:r>
     </w:p>
@@ -559,7 +554,7 @@
     <w:p>
       <w:r>
         <w:pict w14:anchorId="16394492">
-          <v:rect id="_x0000_i1071" style="width:0;height:1.5pt" o:hralign="center" o:hrstd="t" o:hr="t" fillcolor="#a0a0a0" stroked="f"/>
+          <v:rect id="_x0000_i1029" style="width:0;height:1.5pt" o:hralign="center" o:hrstd="t" o:hr="t" fillcolor="#a0a0a0" stroked="f"/>
         </w:pict>
       </w:r>
     </w:p>
@@ -647,7 +642,7 @@
     <w:p>
       <w:r>
         <w:pict w14:anchorId="2E084153">
-          <v:rect id="_x0000_i1072" style="width:0;height:1.5pt" o:hralign="center" o:hrstd="t" o:hr="t" fillcolor="#a0a0a0" stroked="f"/>
+          <v:rect id="_x0000_i1030" style="width:0;height:1.5pt" o:hralign="center" o:hrstd="t" o:hr="t" fillcolor="#a0a0a0" stroked="f"/>
         </w:pict>
       </w:r>
     </w:p>
@@ -707,59 +702,29 @@
         </w:numPr>
       </w:pPr>
       <w:r>
+        <w:t>Documentation</w:t>
+      </w:r>
+    </w:p>
+    <w:p>
+      <w:pPr>
+        <w:numPr>
+          <w:ilvl w:val="0"/>
+          <w:numId w:val="8"/>
+        </w:numPr>
+      </w:pPr>
+      <w:r>
         <w:lastRenderedPageBreak/>
-        <w:t>Documentation</w:t>
-      </w:r>
-    </w:p>
-    <w:p>
-      <w:pPr>
-        <w:numPr>
-          <w:ilvl w:val="0"/>
-          <w:numId w:val="8"/>
-        </w:numPr>
-      </w:pPr>
-      <w:r>
         <w:t>Asset Register</w:t>
       </w:r>
     </w:p>
     <w:p>
       <w:r>
         <w:pict w14:anchorId="0DBECE0B">
-          <v:rect id="_x0000_i1073" style="width:0;height:1.5pt" o:hralign="center" o:hrstd="t" o:hr="t" fillcolor="#a0a0a0" stroked="f"/>
+          <v:rect id="_x0000_i1031" style="width:0;height:1.5pt" o:hralign="center" o:hrstd="t" o:hr="t" fillcolor="#a0a0a0" stroked="f"/>
         </w:pict>
       </w:r>
     </w:p>
     <w:p>
-      <w:pPr>
-        <w:rPr>
-          <w:b/>
-          <w:bCs/>
-        </w:rPr>
-      </w:pPr>
-      <w:r>
-        <w:rPr>
-          <w:b/>
-          <w:bCs/>
-        </w:rPr>
-        <w:t>Why this is important...</w:t>
-      </w:r>
-    </w:p>
-    <w:p>
-      <w:r>
-        <w:t>Imagine one BR says:</w:t>
-      </w:r>
-    </w:p>
-    <w:p>
-      <w:r>
-        <w:t>Improve File Sharing.</w:t>
-      </w:r>
-    </w:p>
-    <w:p>
-      <w:r>
-        <w:t>That's still not enough to design anything.</w:t>
-      </w:r>
-    </w:p>
-    <w:p>
       <w:r>
         <w:t>Now we need to understand things like:</w:t>
       </w:r>
@@ -850,11 +815,6 @@
       </w:pPr>
       <w:r>
         <w:t>File growth?</w:t>
-      </w:r>
-    </w:p>
-    <w:p>
-      <w:r>
-        <w:t>That's Technical Discovery.</w:t>
       </w:r>
     </w:p>
     <w:p/>
@@ -2843,6 +2803,7 @@
   <w:style w:type="character" w:default="1" w:styleId="DefaultParagraphFont">
     <w:name w:val="Default Paragraph Font"/>
     <w:uiPriority w:val="1"/>
+    <w:semiHidden/>
     <w:unhideWhenUsed/>
   </w:style>
   <w:style w:type="table" w:default="1" w:styleId="TableNormal">

</xml_diff>